<commit_message>
update documentation and add functionality to generate_runs
</commit_message>
<xml_diff>
--- a/documentation/CEPAC Dynamic Model Detailed Change Log.docx
+++ b/documentation/CEPAC Dynamic Model Detailed Change Log.docx
@@ -23,11 +23,17 @@
         <w:jc w:val="center"/>
       </w:pPr>
       <w:r>
-        <w:t>Last updated: July 2</w:t>
+        <w:t xml:space="preserve">Last updated: July </w:t>
+      </w:r>
+      <w:r>
+        <w:t>2</w:t>
       </w:r>
       <w:bookmarkStart w:id="0" w:name="_GoBack"/>
       <w:bookmarkEnd w:id="0"/>
       <w:r>
+        <w:t>2</w:t>
+      </w:r>
+      <w:r>
         <w:t>, 2014</w:t>
       </w:r>
     </w:p>
@@ -41,6 +47,15 @@
     </w:p>
     <w:sdt>
       <w:sdtPr>
+        <w:rPr>
+          <w:rFonts w:asciiTheme="minorHAnsi" w:eastAsiaTheme="minorHAnsi" w:hAnsiTheme="minorHAnsi" w:cstheme="minorBidi"/>
+          <w:b w:val="0"/>
+          <w:bCs w:val="0"/>
+          <w:color w:val="auto"/>
+          <w:sz w:val="22"/>
+          <w:szCs w:val="22"/>
+          <w:lang w:eastAsia="en-US"/>
+        </w:rPr>
         <w:id w:val="1225489919"/>
         <w:docPartObj>
           <w:docPartGallery w:val="Table of Contents"/>
@@ -49,12 +64,7 @@
       </w:sdtPr>
       <w:sdtEndPr>
         <w:rPr>
-          <w:rFonts w:asciiTheme="minorHAnsi" w:eastAsiaTheme="minorHAnsi" w:hAnsiTheme="minorHAnsi" w:cstheme="minorBidi"/>
           <w:noProof/>
-          <w:color w:val="auto"/>
-          <w:sz w:val="22"/>
-          <w:szCs w:val="22"/>
-          <w:lang w:eastAsia="en-US"/>
         </w:rPr>
       </w:sdtEndPr>
       <w:sdtContent>
@@ -11585,6 +11595,359 @@
         <w:t>The concept of “target groups” has been added to the model. These are similar to groups in experimental studies. If we assume we are replicating an observational study, this might also be called a cohort. A group is all people who meet a set of eligibility criteria. Criteria are similar to those previously used as targets for targeted interventions. They are as follows:</w:t>
       </w:r>
     </w:p>
+    <w:tbl>
+      <w:tblPr>
+        <w:tblStyle w:val="TableGrid"/>
+        <w:tblW w:w="0" w:type="auto"/>
+        <w:tblLook w:val="04A0" w:firstRow="1" w:lastRow="0" w:firstColumn="1" w:lastColumn="0" w:noHBand="0" w:noVBand="1"/>
+      </w:tblPr>
+      <w:tblGrid>
+        <w:gridCol w:w="3528"/>
+        <w:gridCol w:w="6048"/>
+      </w:tblGrid>
+      <w:tr>
+        <w:tc>
+          <w:tcPr>
+            <w:tcW w:w="3528" w:type="dxa"/>
+          </w:tcPr>
+          <w:p>
+            <w:pPr>
+              <w:rPr>
+                <w:b/>
+              </w:rPr>
+            </w:pPr>
+            <w:r>
+              <w:rPr>
+                <w:b/>
+              </w:rPr>
+              <w:t>Attribute</w:t>
+            </w:r>
+          </w:p>
+        </w:tc>
+        <w:tc>
+          <w:tcPr>
+            <w:tcW w:w="6048" w:type="dxa"/>
+          </w:tcPr>
+          <w:p>
+            <w:pPr>
+              <w:rPr>
+                <w:b/>
+              </w:rPr>
+            </w:pPr>
+            <w:r>
+              <w:rPr>
+                <w:b/>
+              </w:rPr>
+              <w:t>Value</w:t>
+            </w:r>
+          </w:p>
+        </w:tc>
+      </w:tr>
+      <w:tr>
+        <w:tc>
+          <w:tcPr>
+            <w:tcW w:w="3528" w:type="dxa"/>
+          </w:tcPr>
+          <w:p>
+            <w:pPr>
+              <w:rPr>
+                <w:rFonts w:ascii="Consolas" w:hAnsi="Consolas" w:cs="Consolas"/>
+              </w:rPr>
+            </w:pPr>
+            <w:r>
+              <w:rPr>
+                <w:rFonts w:ascii="Consolas" w:hAnsi="Consolas" w:cs="Consolas"/>
+              </w:rPr>
+              <w:t>age</w:t>
+            </w:r>
+          </w:p>
+        </w:tc>
+        <w:tc>
+          <w:tcPr>
+            <w:tcW w:w="6048" w:type="dxa"/>
+          </w:tcPr>
+          <w:p>
+            <w:r>
+              <w:t>a particular age in months or a range of the form “lower-upper” including endpoints also in months</w:t>
+            </w:r>
+          </w:p>
+        </w:tc>
+      </w:tr>
+      <w:tr>
+        <w:tc>
+          <w:tcPr>
+            <w:tcW w:w="3528" w:type="dxa"/>
+          </w:tcPr>
+          <w:p>
+            <w:pPr>
+              <w:rPr>
+                <w:rFonts w:ascii="Consolas" w:hAnsi="Consolas" w:cs="Consolas"/>
+              </w:rPr>
+            </w:pPr>
+            <w:r>
+              <w:rPr>
+                <w:rFonts w:ascii="Consolas" w:hAnsi="Consolas" w:cs="Consolas"/>
+              </w:rPr>
+              <w:t>gender</w:t>
+            </w:r>
+          </w:p>
+        </w:tc>
+        <w:tc>
+          <w:tcPr>
+            <w:tcW w:w="6048" w:type="dxa"/>
+          </w:tcPr>
+          <w:p>
+            <w:r>
+              <w:t>male, female</w:t>
+            </w:r>
+          </w:p>
+        </w:tc>
+      </w:tr>
+      <w:tr>
+        <w:tc>
+          <w:tcPr>
+            <w:tcW w:w="3528" w:type="dxa"/>
+          </w:tcPr>
+          <w:p>
+            <w:pPr>
+              <w:rPr>
+                <w:rFonts w:ascii="Consolas" w:hAnsi="Consolas" w:cs="Consolas"/>
+              </w:rPr>
+            </w:pPr>
+            <w:r>
+              <w:rPr>
+                <w:rFonts w:ascii="Consolas" w:hAnsi="Consolas" w:cs="Consolas"/>
+              </w:rPr>
+              <w:t>sexual-orientation</w:t>
+            </w:r>
+          </w:p>
+        </w:tc>
+        <w:tc>
+          <w:tcPr>
+            <w:tcW w:w="6048" w:type="dxa"/>
+          </w:tcPr>
+          <w:p>
+            <w:r>
+              <w:t>hetero, homo</w:t>
+            </w:r>
+          </w:p>
+        </w:tc>
+      </w:tr>
+      <w:tr>
+        <w:tc>
+          <w:tcPr>
+            <w:tcW w:w="3528" w:type="dxa"/>
+          </w:tcPr>
+          <w:p>
+            <w:pPr>
+              <w:rPr>
+                <w:rFonts w:ascii="Consolas" w:hAnsi="Consolas" w:cs="Consolas"/>
+              </w:rPr>
+            </w:pPr>
+            <w:r>
+              <w:rPr>
+                <w:rFonts w:ascii="Consolas" w:hAnsi="Consolas" w:cs="Consolas"/>
+              </w:rPr>
+              <w:t>sexual-activity-status</w:t>
+            </w:r>
+          </w:p>
+        </w:tc>
+        <w:tc>
+          <w:tcPr>
+            <w:tcW w:w="6048" w:type="dxa"/>
+          </w:tcPr>
+          <w:p>
+            <w:r>
+              <w:t>active, not-active</w:t>
+            </w:r>
+          </w:p>
+        </w:tc>
+      </w:tr>
+      <w:tr>
+        <w:tc>
+          <w:tcPr>
+            <w:tcW w:w="3528" w:type="dxa"/>
+          </w:tcPr>
+          <w:p>
+            <w:pPr>
+              <w:rPr>
+                <w:rFonts w:ascii="Consolas" w:hAnsi="Consolas" w:cs="Consolas"/>
+              </w:rPr>
+            </w:pPr>
+            <w:r>
+              <w:rPr>
+                <w:rFonts w:ascii="Consolas" w:hAnsi="Consolas" w:cs="Consolas"/>
+              </w:rPr>
+              <w:t>relationship-status</w:t>
+            </w:r>
+          </w:p>
+        </w:tc>
+        <w:tc>
+          <w:tcPr>
+            <w:tcW w:w="6048" w:type="dxa"/>
+          </w:tcPr>
+          <w:p>
+            <w:r>
+              <w:t>single, non-single</w:t>
+            </w:r>
+          </w:p>
+        </w:tc>
+      </w:tr>
+      <w:tr>
+        <w:tc>
+          <w:tcPr>
+            <w:tcW w:w="3528" w:type="dxa"/>
+          </w:tcPr>
+          <w:p>
+            <w:pPr>
+              <w:rPr>
+                <w:rFonts w:ascii="Consolas" w:hAnsi="Consolas" w:cs="Consolas"/>
+              </w:rPr>
+            </w:pPr>
+            <w:r>
+              <w:rPr>
+                <w:rFonts w:ascii="Consolas" w:hAnsi="Consolas" w:cs="Consolas"/>
+              </w:rPr>
+              <w:t>employment</w:t>
+            </w:r>
+          </w:p>
+        </w:tc>
+        <w:tc>
+          <w:tcPr>
+            <w:tcW w:w="6048" w:type="dxa"/>
+          </w:tcPr>
+          <w:p>
+            <w:r>
+              <w:t>csw, non-csw</w:t>
+            </w:r>
+          </w:p>
+        </w:tc>
+      </w:tr>
+      <w:tr>
+        <w:tc>
+          <w:tcPr>
+            <w:tcW w:w="3528" w:type="dxa"/>
+          </w:tcPr>
+          <w:p>
+            <w:pPr>
+              <w:rPr>
+                <w:rFonts w:ascii="Consolas" w:hAnsi="Consolas" w:cs="Consolas"/>
+              </w:rPr>
+            </w:pPr>
+            <w:r>
+              <w:rPr>
+                <w:rFonts w:ascii="Consolas" w:hAnsi="Consolas" w:cs="Consolas"/>
+              </w:rPr>
+              <w:t>hiv-status</w:t>
+            </w:r>
+          </w:p>
+        </w:tc>
+        <w:tc>
+          <w:tcPr>
+            <w:tcW w:w="6048" w:type="dxa"/>
+          </w:tcPr>
+          <w:p>
+            <w:r>
+              <w:t>negative</w:t>
+            </w:r>
+            <w:r>
+              <w:t>, observed-acute, observed-chronic, observed-latestage, unobserved-acute, unobserved-chronic, unobserved-latestage</w:t>
+            </w:r>
+          </w:p>
+        </w:tc>
+      </w:tr>
+      <w:tr>
+        <w:tc>
+          <w:tcPr>
+            <w:tcW w:w="3528" w:type="dxa"/>
+          </w:tcPr>
+          <w:p>
+            <w:pPr>
+              <w:rPr>
+                <w:rFonts w:ascii="Consolas" w:hAnsi="Consolas" w:cs="Consolas"/>
+              </w:rPr>
+            </w:pPr>
+            <w:r>
+              <w:rPr>
+                <w:rFonts w:ascii="Consolas" w:hAnsi="Consolas" w:cs="Consolas"/>
+              </w:rPr>
+              <w:t>treatment-status</w:t>
+            </w:r>
+          </w:p>
+        </w:tc>
+        <w:tc>
+          <w:tcPr>
+            <w:tcW w:w="6048" w:type="dxa"/>
+          </w:tcPr>
+          <w:p>
+            <w:r>
+              <w:t>treated, untreated</w:t>
+            </w:r>
+          </w:p>
+        </w:tc>
+      </w:tr>
+      <w:tr>
+        <w:tc>
+          <w:tcPr>
+            <w:tcW w:w="3528" w:type="dxa"/>
+          </w:tcPr>
+          <w:p>
+            <w:pPr>
+              <w:rPr>
+                <w:rFonts w:ascii="Consolas" w:hAnsi="Consolas" w:cs="Consolas"/>
+              </w:rPr>
+            </w:pPr>
+            <w:r>
+              <w:rPr>
+                <w:rFonts w:ascii="Consolas" w:hAnsi="Consolas" w:cs="Consolas"/>
+              </w:rPr>
+              <w:t>circumcised</w:t>
+            </w:r>
+          </w:p>
+        </w:tc>
+        <w:tc>
+          <w:tcPr>
+            <w:tcW w:w="6048" w:type="dxa"/>
+          </w:tcPr>
+          <w:p>
+            <w:r>
+              <w:t>true, false</w:t>
+            </w:r>
+          </w:p>
+        </w:tc>
+      </w:tr>
+      <w:tr>
+        <w:tc>
+          <w:tcPr>
+            <w:tcW w:w="3528" w:type="dxa"/>
+          </w:tcPr>
+          <w:p>
+            <w:pPr>
+              <w:rPr>
+                <w:rFonts w:ascii="Consolas" w:hAnsi="Consolas" w:cs="Consolas"/>
+              </w:rPr>
+            </w:pPr>
+            <w:r>
+              <w:rPr>
+                <w:rFonts w:ascii="Consolas" w:hAnsi="Consolas" w:cs="Consolas"/>
+              </w:rPr>
+              <w:t>risk-group</w:t>
+            </w:r>
+          </w:p>
+        </w:tc>
+        <w:tc>
+          <w:tcPr>
+            <w:tcW w:w="6048" w:type="dxa"/>
+          </w:tcPr>
+          <w:p>
+            <w:r>
+              <w:t>high, low</w:t>
+            </w:r>
+          </w:p>
+        </w:tc>
+      </w:tr>
+    </w:tbl>
+    <w:p/>
     <w:p>
       <w:r>
         <w:t>To allow for more realistic experimental designs, target groups are further divided into partitions. Every member of the population who meets the group criteria are randomly assigned one of the partitions. Each partition receives a defined percentage of the newly joined people.</w:t>
@@ -11603,6 +11966,12 @@
         <w:t xml:space="preserve"> The syntax for interventions is defined in the next section.</w:t>
       </w:r>
     </w:p>
+    <w:p>
+      <w:r>
+        <w:br w:type="page"/>
+      </w:r>
+    </w:p>
+    <w:p/>
     <w:p>
       <w:pPr>
         <w:spacing w:line="240" w:lineRule="auto"/>
@@ -12031,15 +12400,6 @@
         </w:rPr>
         <w:t>&lt;/target-groups&gt;</w:t>
       </w:r>
-    </w:p>
-    <w:p>
-      <w:pPr>
-        <w:spacing w:line="240" w:lineRule="auto"/>
-        <w:contextualSpacing/>
-        <w:rPr>
-          <w:rFonts w:ascii="Consolas" w:hAnsi="Consolas" w:cs="Consolas"/>
-        </w:rPr>
-      </w:pPr>
     </w:p>
     <w:p>
       <w:r>
@@ -15654,7 +16014,6 @@
       <w:spacing w:after="0" w:line="240" w:lineRule="auto"/>
     </w:pPr>
     <w:tblPr>
-      <w:tblInd w:w="0" w:type="dxa"/>
       <w:tblBorders>
         <w:top w:val="single" w:sz="4" w:space="0" w:color="auto"/>
         <w:left w:val="single" w:sz="4" w:space="0" w:color="auto"/>
@@ -15663,12 +16022,6 @@
         <w:insideH w:val="single" w:sz="4" w:space="0" w:color="auto"/>
         <w:insideV w:val="single" w:sz="4" w:space="0" w:color="auto"/>
       </w:tblBorders>
-      <w:tblCellMar>
-        <w:top w:w="0" w:type="dxa"/>
-        <w:left w:w="108" w:type="dxa"/>
-        <w:bottom w:w="0" w:type="dxa"/>
-        <w:right w:w="108" w:type="dxa"/>
-      </w:tblCellMar>
     </w:tblPr>
   </w:style>
   <w:style w:type="paragraph" w:styleId="Title">
@@ -16118,7 +16471,6 @@
       <w:spacing w:after="0" w:line="240" w:lineRule="auto"/>
     </w:pPr>
     <w:tblPr>
-      <w:tblInd w:w="0" w:type="dxa"/>
       <w:tblBorders>
         <w:top w:val="single" w:sz="4" w:space="0" w:color="auto"/>
         <w:left w:val="single" w:sz="4" w:space="0" w:color="auto"/>
@@ -16127,12 +16479,6 @@
         <w:insideH w:val="single" w:sz="4" w:space="0" w:color="auto"/>
         <w:insideV w:val="single" w:sz="4" w:space="0" w:color="auto"/>
       </w:tblBorders>
-      <w:tblCellMar>
-        <w:top w:w="0" w:type="dxa"/>
-        <w:left w:w="108" w:type="dxa"/>
-        <w:bottom w:w="0" w:type="dxa"/>
-        <w:right w:w="108" w:type="dxa"/>
-      </w:tblCellMar>
     </w:tblPr>
   </w:style>
   <w:style w:type="paragraph" w:styleId="Title">
@@ -16629,7 +16975,7 @@
 </file>
 
 <file path=customXml/itemProps1.xml><?xml version="1.0" encoding="utf-8"?>
-<ds:datastoreItem xmlns:ds="http://schemas.openxmlformats.org/officeDocument/2006/customXml" ds:itemID="{6C8CCBDD-D0CE-4BEC-B9FF-BD165A2EDDDD}">
+<ds:datastoreItem xmlns:ds="http://schemas.openxmlformats.org/officeDocument/2006/customXml" ds:itemID="{2DA7371D-17F3-461C-B03E-9A5963E4738F}">
   <ds:schemaRefs>
     <ds:schemaRef ds:uri="http://schemas.openxmlformats.org/officeDocument/2006/bibliography"/>
   </ds:schemaRefs>

</xml_diff>